<commit_message>
Precios definidos: 1er nivel US$ 100 (con colposcopia US$ 250), 2º US$ 250, 3º/4º/laboratorios US$ 501; implantación 200/500/550
Co-Authored-By: Claude Opus 5.5 <noreply@anthropic.com>
Claude-Session: https://claude.ai/code/session_015MG6VeavRZnDbjYZyzDjvL
</commit_message>
<xml_diff>
--- a/docs/empresa/SIVEC-contrato-modelo.docx
+++ b/docs/empresa/SIVEC-contrato-modelo.docx
@@ -449,7 +449,27 @@
         <w:t xml:space="preserve">incluidos los de las provincias</w:t>
       </w:r>
       <w:r>
-        <w:t xml:space="preserve"> que pertenezcan a una red), 2º nivel (hospitales básicos), 3er nivel (hospitales generales y de especialidad), laboratorios de citología o VPH y el Instituto Oncológico (4º nivel).</w:t>
+        <w:t xml:space="preserve"> que pertenezcan a una red), 2º nivel (hospitales básicos), 3er nivel (hospitales generales y de especialidad), 4º nivel (Instituto Oncológico) y laboratorios de citología (PAP) y de VPH.</w:t>
+      </w:r>
+    </w:p>
+    <w:p>
+      <w:pPr>
+        <w:pStyle w:val="ListParagraph"/>
+        <w:numPr>
+          <w:ilvl w:val="0"/>
+          <w:numId w:val="3"/>
+        </w:numPr>
+        <w:spacing w:after="80" w:line="280"/>
+      </w:pPr>
+      <w:r>
+        <w:rPr>
+          <w:b/>
+          <w:bCs/>
+        </w:rPr>
+        <w:t xml:space="preserve">Centro de 1er nivel con colposcopia y biopsia:</w:t>
+      </w:r>
+      <w:r>
+        <w:t xml:space="preserve"> centro de salud que tiene el servicio de colposcopia y toma de biopsia habilitado en el SIVEC.</w:t>
       </w:r>
     </w:p>
     <w:p>
@@ -1088,7 +1108,7 @@
               <w:spacing w:after="40"/>
             </w:pPr>
             <w:r>
-              <w:t xml:space="preserve">1er nivel (centro o puesto de salud, ciudad o provincia)</w:t>
+              <w:t xml:space="preserve">1er nivel sin colposcopia ni biopsia (centro o puesto de salud, ciudad o provincia)</w:t>
             </w:r>
           </w:p>
         </w:tc>
@@ -1147,7 +1167,7 @@
               <w:spacing w:after="40"/>
             </w:pPr>
             <w:r>
-              <w:t xml:space="preserve">2º nivel (hospital básico)</w:t>
+              <w:t xml:space="preserve">1er nivel con colposcopia y biopsia</w:t>
             </w:r>
           </w:p>
         </w:tc>
@@ -1206,7 +1226,7 @@
               <w:spacing w:after="40"/>
             </w:pPr>
             <w:r>
-              <w:t xml:space="preserve">3er nivel, laboratorio (citología/VPH) y Oncológico (4º nivel)</w:t>
+              <w:t xml:space="preserve">2º nivel (hospital básico)</w:t>
             </w:r>
           </w:p>
         </w:tc>
@@ -1225,7 +1245,7 @@
               <w:spacing w:after="40"/>
             </w:pPr>
             <w:r>
-              <w:t xml:space="preserve">US$ 501</w:t>
+              <w:t xml:space="preserve">US$ 250</w:t>
             </w:r>
           </w:p>
         </w:tc>
@@ -1244,7 +1264,7 @@
               <w:spacing w:after="40"/>
             </w:pPr>
             <w:r>
-              <w:t xml:space="preserve">Bs 3.486,96</w:t>
+              <w:t xml:space="preserve">Bs 1.740,00</w:t>
             </w:r>
           </w:p>
         </w:tc>
@@ -1265,7 +1285,7 @@
               <w:spacing w:after="40"/>
             </w:pPr>
             <w:r>
-              <w:t xml:space="preserve">Tablero de gestión de la red (por red)</w:t>
+              <w:t xml:space="preserve">3er nivel, 4º nivel (Oncológico) y laboratorios de citología PAP y de VPH</w:t>
             </w:r>
           </w:p>
         </w:tc>
@@ -1284,10 +1304,7 @@
               <w:spacing w:after="40"/>
             </w:pPr>
             <w:r>
-              <w:rPr>
-                <w:shd w:fill="FFF176" w:color="auto" w:val="clear"/>
-              </w:rPr>
-              <w:t xml:space="preserve">US$ 300 / incluido</w:t>
+              <w:t xml:space="preserve">US$ 501</w:t>
             </w:r>
           </w:p>
         </w:tc>
@@ -1306,10 +1323,66 @@
               <w:spacing w:after="40"/>
             </w:pPr>
             <w:r>
-              <w:rPr>
-                <w:shd w:fill="FFF176" w:color="auto" w:val="clear"/>
-              </w:rPr>
-              <w:t xml:space="preserve">Bs 2.088,00</w:t>
+              <w:t xml:space="preserve">Bs 3.486,96</w:t>
+            </w:r>
+          </w:p>
+        </w:tc>
+      </w:tr>
+      <w:tr>
+        <w:tc>
+          <w:tcPr>
+            <w:tcW w:type="dxa" w:w="4800"/>
+            <w:tcMar>
+              <w:top w:type="dxa" w:w="60"/>
+              <w:left w:type="dxa" w:w="100"/>
+              <w:bottom w:type="dxa" w:w="60"/>
+              <w:right w:type="dxa" w:w="100"/>
+            </w:tcMar>
+          </w:tcPr>
+          <w:p>
+            <w:pPr>
+              <w:spacing w:after="40"/>
+            </w:pPr>
+            <w:r>
+              <w:t xml:space="preserve">Tablero de gestión de la red y administración</w:t>
+            </w:r>
+          </w:p>
+        </w:tc>
+        <w:tc>
+          <w:tcPr>
+            <w:tcW w:type="dxa" w:w="1900"/>
+            <w:tcMar>
+              <w:top w:type="dxa" w:w="60"/>
+              <w:left w:type="dxa" w:w="100"/>
+              <w:bottom w:type="dxa" w:w="60"/>
+              <w:right w:type="dxa" w:w="100"/>
+            </w:tcMar>
+          </w:tcPr>
+          <w:p>
+            <w:pPr>
+              <w:spacing w:after="40"/>
+            </w:pPr>
+            <w:r>
+              <w:t xml:space="preserve">Incluido</w:t>
+            </w:r>
+          </w:p>
+        </w:tc>
+        <w:tc>
+          <w:tcPr>
+            <w:tcW w:type="dxa" w:w="2326"/>
+            <w:tcMar>
+              <w:top w:type="dxa" w:w="60"/>
+              <w:left w:type="dxa" w:w="100"/>
+              <w:bottom w:type="dxa" w:w="60"/>
+              <w:right w:type="dxa" w:w="100"/>
+            </w:tcMar>
+          </w:tcPr>
+          <w:p>
+            <w:pPr>
+              <w:spacing w:after="40"/>
+            </w:pPr>
+            <w:r>
+              <w:t xml:space="preserve">Incluido</w:t>
             </w:r>
           </w:p>
         </w:tc>
@@ -1447,8 +1520,9 @@
         </w:tblBorders>
       </w:tblPr>
       <w:tblGrid>
-        <w:gridCol w:w="5500"/>
-        <w:gridCol w:w="3526"/>
+        <w:gridCol w:w="4400"/>
+        <w:gridCol w:w="2400"/>
+        <w:gridCol w:w="2226"/>
       </w:tblGrid>
       <w:tr>
         <w:trPr>
@@ -1456,7 +1530,7 @@
         </w:trPr>
         <w:tc>
           <w:tcPr>
-            <w:tcW w:type="dxa" w:w="5500"/>
+            <w:tcW w:type="dxa" w:w="4400"/>
             <w:shd w:fill="F6E6EC" w:color="auto" w:val="clear"/>
             <w:tcMar>
               <w:top w:type="dxa" w:w="60"/>
@@ -1481,7 +1555,7 @@
         </w:tc>
         <w:tc>
           <w:tcPr>
-            <w:tcW w:type="dxa" w:w="3526"/>
+            <w:tcW w:type="dxa" w:w="2400"/>
             <w:shd w:fill="F6E6EC" w:color="auto" w:val="clear"/>
             <w:tcMar>
               <w:top w:type="dxa" w:w="60"/>
@@ -1504,46 +1578,87 @@
             </w:r>
           </w:p>
         </w:tc>
+        <w:tc>
+          <w:tcPr>
+            <w:tcW w:type="dxa" w:w="2226"/>
+            <w:shd w:fill="F6E6EC" w:color="auto" w:val="clear"/>
+            <w:tcMar>
+              <w:top w:type="dxa" w:w="60"/>
+              <w:left w:type="dxa" w:w="100"/>
+              <w:bottom w:type="dxa" w:w="60"/>
+              <w:right w:type="dxa" w:w="100"/>
+            </w:tcMar>
+          </w:tcPr>
+          <w:p>
+            <w:pPr>
+              <w:spacing w:after="40"/>
+            </w:pPr>
+            <w:r>
+              <w:rPr>
+                <w:b/>
+                <w:bCs/>
+                <w:color w:val="7D2A4C"/>
+              </w:rPr>
+              <w:t xml:space="preserve">Bs (TC 6,96)</w:t>
+            </w:r>
+          </w:p>
+        </w:tc>
       </w:tr>
       <w:tr>
         <w:tc>
           <w:tcPr>
-            <w:tcW w:type="dxa" w:w="5500"/>
-            <w:tcMar>
-              <w:top w:type="dxa" w:w="60"/>
-              <w:left w:type="dxa" w:w="100"/>
-              <w:bottom w:type="dxa" w:w="60"/>
-              <w:right w:type="dxa" w:w="100"/>
-            </w:tcMar>
-          </w:tcPr>
-          <w:p>
-            <w:pPr>
-              <w:spacing w:after="40"/>
-            </w:pPr>
-            <w:r>
-              <w:t xml:space="preserve">1er nivel</w:t>
-            </w:r>
-          </w:p>
-        </w:tc>
-        <w:tc>
-          <w:tcPr>
-            <w:tcW w:type="dxa" w:w="3526"/>
-            <w:tcMar>
-              <w:top w:type="dxa" w:w="60"/>
-              <w:left w:type="dxa" w:w="100"/>
-              <w:bottom w:type="dxa" w:w="60"/>
-              <w:right w:type="dxa" w:w="100"/>
-            </w:tcMar>
-          </w:tcPr>
-          <w:p>
-            <w:pPr>
-              <w:spacing w:after="40"/>
-            </w:pPr>
-            <w:r>
-              <w:rPr>
-                <w:shd w:fill="FFF176" w:color="auto" w:val="clear"/>
-              </w:rPr>
-              <w:t xml:space="preserve">US$ 500</w:t>
+            <w:tcW w:type="dxa" w:w="4400"/>
+            <w:tcMar>
+              <w:top w:type="dxa" w:w="60"/>
+              <w:left w:type="dxa" w:w="100"/>
+              <w:bottom w:type="dxa" w:w="60"/>
+              <w:right w:type="dxa" w:w="100"/>
+            </w:tcMar>
+          </w:tcPr>
+          <w:p>
+            <w:pPr>
+              <w:spacing w:after="40"/>
+            </w:pPr>
+            <w:r>
+              <w:t xml:space="preserve">1er nivel (con o sin colposcopia)</w:t>
+            </w:r>
+          </w:p>
+        </w:tc>
+        <w:tc>
+          <w:tcPr>
+            <w:tcW w:type="dxa" w:w="2400"/>
+            <w:tcMar>
+              <w:top w:type="dxa" w:w="60"/>
+              <w:left w:type="dxa" w:w="100"/>
+              <w:bottom w:type="dxa" w:w="60"/>
+              <w:right w:type="dxa" w:w="100"/>
+            </w:tcMar>
+          </w:tcPr>
+          <w:p>
+            <w:pPr>
+              <w:spacing w:after="40"/>
+            </w:pPr>
+            <w:r>
+              <w:t xml:space="preserve">US$ 200</w:t>
+            </w:r>
+          </w:p>
+        </w:tc>
+        <w:tc>
+          <w:tcPr>
+            <w:tcW w:type="dxa" w:w="2226"/>
+            <w:tcMar>
+              <w:top w:type="dxa" w:w="60"/>
+              <w:left w:type="dxa" w:w="100"/>
+              <w:bottom w:type="dxa" w:w="60"/>
+              <w:right w:type="dxa" w:w="100"/>
+            </w:tcMar>
+          </w:tcPr>
+          <w:p>
+            <w:pPr>
+              <w:spacing w:after="40"/>
+            </w:pPr>
+            <w:r>
+              <w:t xml:space="preserve">Bs 1.392,00</w:t>
             </w:r>
           </w:p>
         </w:tc>
@@ -1551,7 +1666,7 @@
       <w:tr>
         <w:tc>
           <w:tcPr>
-            <w:tcW w:type="dxa" w:w="5500"/>
+            <w:tcW w:type="dxa" w:w="4400"/>
             <w:tcMar>
               <w:top w:type="dxa" w:w="60"/>
               <w:left w:type="dxa" w:w="100"/>
@@ -1570,23 +1685,39 @@
         </w:tc>
         <w:tc>
           <w:tcPr>
-            <w:tcW w:type="dxa" w:w="3526"/>
-            <w:tcMar>
-              <w:top w:type="dxa" w:w="60"/>
-              <w:left w:type="dxa" w:w="100"/>
-              <w:bottom w:type="dxa" w:w="60"/>
-              <w:right w:type="dxa" w:w="100"/>
-            </w:tcMar>
-          </w:tcPr>
-          <w:p>
-            <w:pPr>
-              <w:spacing w:after="40"/>
-            </w:pPr>
-            <w:r>
-              <w:rPr>
-                <w:shd w:fill="FFF176" w:color="auto" w:val="clear"/>
-              </w:rPr>
-              <w:t xml:space="preserve">US$ 1.000</w:t>
+            <w:tcW w:type="dxa" w:w="2400"/>
+            <w:tcMar>
+              <w:top w:type="dxa" w:w="60"/>
+              <w:left w:type="dxa" w:w="100"/>
+              <w:bottom w:type="dxa" w:w="60"/>
+              <w:right w:type="dxa" w:w="100"/>
+            </w:tcMar>
+          </w:tcPr>
+          <w:p>
+            <w:pPr>
+              <w:spacing w:after="40"/>
+            </w:pPr>
+            <w:r>
+              <w:t xml:space="preserve">US$ 500</w:t>
+            </w:r>
+          </w:p>
+        </w:tc>
+        <w:tc>
+          <w:tcPr>
+            <w:tcW w:type="dxa" w:w="2226"/>
+            <w:tcMar>
+              <w:top w:type="dxa" w:w="60"/>
+              <w:left w:type="dxa" w:w="100"/>
+              <w:bottom w:type="dxa" w:w="60"/>
+              <w:right w:type="dxa" w:w="100"/>
+            </w:tcMar>
+          </w:tcPr>
+          <w:p>
+            <w:pPr>
+              <w:spacing w:after="40"/>
+            </w:pPr>
+            <w:r>
+              <w:t xml:space="preserve">Bs 3.480,00</w:t>
             </w:r>
           </w:p>
         </w:tc>
@@ -1594,42 +1725,58 @@
       <w:tr>
         <w:tc>
           <w:tcPr>
-            <w:tcW w:type="dxa" w:w="5500"/>
-            <w:tcMar>
-              <w:top w:type="dxa" w:w="60"/>
-              <w:left w:type="dxa" w:w="100"/>
-              <w:bottom w:type="dxa" w:w="60"/>
-              <w:right w:type="dxa" w:w="100"/>
-            </w:tcMar>
-          </w:tcPr>
-          <w:p>
-            <w:pPr>
-              <w:spacing w:after="40"/>
-            </w:pPr>
-            <w:r>
-              <w:t xml:space="preserve">3er nivel, laboratorio u Oncológico</w:t>
-            </w:r>
-          </w:p>
-        </w:tc>
-        <w:tc>
-          <w:tcPr>
-            <w:tcW w:type="dxa" w:w="3526"/>
-            <w:tcMar>
-              <w:top w:type="dxa" w:w="60"/>
-              <w:left w:type="dxa" w:w="100"/>
-              <w:bottom w:type="dxa" w:w="60"/>
-              <w:right w:type="dxa" w:w="100"/>
-            </w:tcMar>
-          </w:tcPr>
-          <w:p>
-            <w:pPr>
-              <w:spacing w:after="40"/>
-            </w:pPr>
-            <w:r>
-              <w:rPr>
-                <w:shd w:fill="FFF176" w:color="auto" w:val="clear"/>
-              </w:rPr>
-              <w:t xml:space="preserve">US$ 1.500</w:t>
+            <w:tcW w:type="dxa" w:w="4400"/>
+            <w:tcMar>
+              <w:top w:type="dxa" w:w="60"/>
+              <w:left w:type="dxa" w:w="100"/>
+              <w:bottom w:type="dxa" w:w="60"/>
+              <w:right w:type="dxa" w:w="100"/>
+            </w:tcMar>
+          </w:tcPr>
+          <w:p>
+            <w:pPr>
+              <w:spacing w:after="40"/>
+            </w:pPr>
+            <w:r>
+              <w:t xml:space="preserve">3er nivel, 4º nivel y laboratorios</w:t>
+            </w:r>
+          </w:p>
+        </w:tc>
+        <w:tc>
+          <w:tcPr>
+            <w:tcW w:type="dxa" w:w="2400"/>
+            <w:tcMar>
+              <w:top w:type="dxa" w:w="60"/>
+              <w:left w:type="dxa" w:w="100"/>
+              <w:bottom w:type="dxa" w:w="60"/>
+              <w:right w:type="dxa" w:w="100"/>
+            </w:tcMar>
+          </w:tcPr>
+          <w:p>
+            <w:pPr>
+              <w:spacing w:after="40"/>
+            </w:pPr>
+            <w:r>
+              <w:t xml:space="preserve">US$ 550</w:t>
+            </w:r>
+          </w:p>
+        </w:tc>
+        <w:tc>
+          <w:tcPr>
+            <w:tcW w:type="dxa" w:w="2226"/>
+            <w:tcMar>
+              <w:top w:type="dxa" w:w="60"/>
+              <w:left w:type="dxa" w:w="100"/>
+              <w:bottom w:type="dxa" w:w="60"/>
+              <w:right w:type="dxa" w:w="100"/>
+            </w:tcMar>
+          </w:tcPr>
+          <w:p>
+            <w:pPr>
+              <w:spacing w:after="40"/>
+            </w:pPr>
+            <w:r>
+              <w:t xml:space="preserve">Bs 3.828,00</w:t>
             </w:r>
           </w:p>
         </w:tc>
@@ -2938,7 +3085,7 @@
         <w:spacing w:after="120" w:line="290"/>
       </w:pPr>
       <w:r>
-        <w:t xml:space="preserve">Ejemplo con la Red Centro. Completar con los establecimientos reales de la ENTIDAD.</w:t>
+        <w:t xml:space="preserve">Ejemplo: Red Centro (9 centros de 1er nivel, uno de ellos con colposcopia y biopsia), un hospital de 2º nivel y el Instituto Oncológico con su laboratorio. Completar con los establecimientos reales de la ENTIDAD.</w:t>
       </w:r>
     </w:p>
     <w:tbl>
@@ -2954,11 +3101,11 @@
         </w:tblBorders>
       </w:tblPr>
       <w:tblGrid>
-        <w:gridCol w:w="3100"/>
-        <w:gridCol w:w="2200"/>
+        <w:gridCol w:w="3000"/>
+        <w:gridCol w:w="800"/>
         <w:gridCol w:w="1300"/>
-        <w:gridCol w:w="1100"/>
-        <w:gridCol w:w="1326"/>
+        <w:gridCol w:w="2126"/>
+        <w:gridCol w:w="1800"/>
       </w:tblGrid>
       <w:tr>
         <w:trPr>
@@ -2966,7 +3113,7 @@
         </w:trPr>
         <w:tc>
           <w:tcPr>
-            <w:tcW w:type="dxa" w:w="3100"/>
+            <w:tcW w:type="dxa" w:w="3000"/>
             <w:shd w:fill="F6E6EC" w:color="auto" w:val="clear"/>
             <w:tcMar>
               <w:top w:type="dxa" w:w="60"/>
@@ -2991,7 +3138,7 @@
         </w:tc>
         <w:tc>
           <w:tcPr>
-            <w:tcW w:type="dxa" w:w="2200"/>
+            <w:tcW w:type="dxa" w:w="800"/>
             <w:shd w:fill="F6E6EC" w:color="auto" w:val="clear"/>
             <w:tcMar>
               <w:top w:type="dxa" w:w="60"/>
@@ -3010,7 +3157,7 @@
                 <w:bCs/>
                 <w:color w:val="7D2A4C"/>
               </w:rPr>
-              <w:t xml:space="preserve">Red / provincia</w:t>
+              <w:t xml:space="preserve">Cant.</w:t>
             </w:r>
           </w:p>
         </w:tc>
@@ -3035,13 +3182,13 @@
                 <w:bCs/>
                 <w:color w:val="7D2A4C"/>
               </w:rPr>
-              <w:t xml:space="preserve">Nivel</w:t>
-            </w:r>
-          </w:p>
-        </w:tc>
-        <w:tc>
-          <w:tcPr>
-            <w:tcW w:type="dxa" w:w="1100"/>
+              <w:t xml:space="preserve">US$/mes c/u</w:t>
+            </w:r>
+          </w:p>
+        </w:tc>
+        <w:tc>
+          <w:tcPr>
+            <w:tcW w:type="dxa" w:w="2126"/>
             <w:shd w:fill="F6E6EC" w:color="auto" w:val="clear"/>
             <w:tcMar>
               <w:top w:type="dxa" w:w="60"/>
@@ -3066,7 +3213,7 @@
         </w:tc>
         <w:tc>
           <w:tcPr>
-            <w:tcW w:type="dxa" w:w="1326"/>
+            <w:tcW w:type="dxa" w:w="1800"/>
             <w:shd w:fill="F6E6EC" w:color="auto" w:val="clear"/>
             <w:tcMar>
               <w:top w:type="dxa" w:w="60"/>
@@ -3085,7 +3232,7 @@
                 <w:bCs/>
                 <w:color w:val="7D2A4C"/>
               </w:rPr>
-              <w:t xml:space="preserve">Bs/mes</w:t>
+              <w:t xml:space="preserve">Implantación US$</w:t>
             </w:r>
           </w:p>
         </w:tc>
@@ -3093,39 +3240,39 @@
       <w:tr>
         <w:tc>
           <w:tcPr>
-            <w:tcW w:type="dxa" w:w="3100"/>
-            <w:tcMar>
-              <w:top w:type="dxa" w:w="60"/>
-              <w:left w:type="dxa" w:w="100"/>
-              <w:bottom w:type="dxa" w:w="60"/>
-              <w:right w:type="dxa" w:w="100"/>
-            </w:tcMar>
-          </w:tcPr>
-          <w:p>
-            <w:pPr>
-              <w:spacing w:after="40"/>
-            </w:pPr>
-            <w:r>
-              <w:t xml:space="preserve">C.S. San Luis</w:t>
-            </w:r>
-          </w:p>
-        </w:tc>
-        <w:tc>
-          <w:tcPr>
-            <w:tcW w:type="dxa" w:w="2200"/>
-            <w:tcMar>
-              <w:top w:type="dxa" w:w="60"/>
-              <w:left w:type="dxa" w:w="100"/>
-              <w:bottom w:type="dxa" w:w="60"/>
-              <w:right w:type="dxa" w:w="100"/>
-            </w:tcMar>
-          </w:tcPr>
-          <w:p>
-            <w:pPr>
-              <w:spacing w:after="40"/>
-            </w:pPr>
-            <w:r>
-              <w:t xml:space="preserve">Red Centro</w:t>
+            <w:tcW w:type="dxa" w:w="3000"/>
+            <w:tcMar>
+              <w:top w:type="dxa" w:w="60"/>
+              <w:left w:type="dxa" w:w="100"/>
+              <w:bottom w:type="dxa" w:w="60"/>
+              <w:right w:type="dxa" w:w="100"/>
+            </w:tcMar>
+          </w:tcPr>
+          <w:p>
+            <w:pPr>
+              <w:spacing w:after="40"/>
+            </w:pPr>
+            <w:r>
+              <w:t xml:space="preserve">1er nivel sin colposcopia ni biopsia</w:t>
+            </w:r>
+          </w:p>
+        </w:tc>
+        <w:tc>
+          <w:tcPr>
+            <w:tcW w:type="dxa" w:w="800"/>
+            <w:tcMar>
+              <w:top w:type="dxa" w:w="60"/>
+              <w:left w:type="dxa" w:w="100"/>
+              <w:bottom w:type="dxa" w:w="60"/>
+              <w:right w:type="dxa" w:w="100"/>
+            </w:tcMar>
+          </w:tcPr>
+          <w:p>
+            <w:pPr>
+              <w:spacing w:after="40"/>
+            </w:pPr>
+            <w:r>
+              <w:t xml:space="preserve">8</w:t>
             </w:r>
           </w:p>
         </w:tc>
@@ -3144,45 +3291,45 @@
               <w:spacing w:after="40"/>
             </w:pPr>
             <w:r>
-              <w:t xml:space="preserve">1er</w:t>
-            </w:r>
-          </w:p>
-        </w:tc>
-        <w:tc>
-          <w:tcPr>
-            <w:tcW w:type="dxa" w:w="1100"/>
-            <w:tcMar>
-              <w:top w:type="dxa" w:w="60"/>
-              <w:left w:type="dxa" w:w="100"/>
-              <w:bottom w:type="dxa" w:w="60"/>
-              <w:right w:type="dxa" w:w="100"/>
-            </w:tcMar>
-          </w:tcPr>
-          <w:p>
-            <w:pPr>
-              <w:spacing w:after="40"/>
-            </w:pPr>
-            <w:r>
               <w:t xml:space="preserve">100</w:t>
             </w:r>
           </w:p>
         </w:tc>
         <w:tc>
           <w:tcPr>
-            <w:tcW w:type="dxa" w:w="1326"/>
-            <w:tcMar>
-              <w:top w:type="dxa" w:w="60"/>
-              <w:left w:type="dxa" w:w="100"/>
-              <w:bottom w:type="dxa" w:w="60"/>
-              <w:right w:type="dxa" w:w="100"/>
-            </w:tcMar>
-          </w:tcPr>
-          <w:p>
-            <w:pPr>
-              <w:spacing w:after="40"/>
-            </w:pPr>
-            <w:r>
-              <w:t xml:space="preserve">696,00</w:t>
+            <w:tcW w:type="dxa" w:w="2126"/>
+            <w:tcMar>
+              <w:top w:type="dxa" w:w="60"/>
+              <w:left w:type="dxa" w:w="100"/>
+              <w:bottom w:type="dxa" w:w="60"/>
+              <w:right w:type="dxa" w:w="100"/>
+            </w:tcMar>
+          </w:tcPr>
+          <w:p>
+            <w:pPr>
+              <w:spacing w:after="40"/>
+            </w:pPr>
+            <w:r>
+              <w:t xml:space="preserve">800</w:t>
+            </w:r>
+          </w:p>
+        </w:tc>
+        <w:tc>
+          <w:tcPr>
+            <w:tcW w:type="dxa" w:w="1800"/>
+            <w:tcMar>
+              <w:top w:type="dxa" w:w="60"/>
+              <w:left w:type="dxa" w:w="100"/>
+              <w:bottom w:type="dxa" w:w="60"/>
+              <w:right w:type="dxa" w:w="100"/>
+            </w:tcMar>
+          </w:tcPr>
+          <w:p>
+            <w:pPr>
+              <w:spacing w:after="40"/>
+            </w:pPr>
+            <w:r>
+              <w:t xml:space="preserve">1.600</w:t>
             </w:r>
           </w:p>
         </w:tc>
@@ -3190,45 +3337,39 @@
       <w:tr>
         <w:tc>
           <w:tcPr>
-            <w:tcW w:type="dxa" w:w="3100"/>
-            <w:tcMar>
-              <w:top w:type="dxa" w:w="60"/>
-              <w:left w:type="dxa" w:w="100"/>
-              <w:bottom w:type="dxa" w:w="60"/>
-              <w:right w:type="dxa" w:w="100"/>
-            </w:tcMar>
-          </w:tcPr>
-          <w:p>
-            <w:pPr>
-              <w:spacing w:after="40"/>
-            </w:pPr>
-            <w:r>
-              <w:rPr>
-                <w:shd w:fill="FFF176" w:color="auto" w:val="clear"/>
-              </w:rPr>
-              <w:t xml:space="preserve">C.S. ...</w:t>
-            </w:r>
-          </w:p>
-        </w:tc>
-        <w:tc>
-          <w:tcPr>
-            <w:tcW w:type="dxa" w:w="2200"/>
-            <w:tcMar>
-              <w:top w:type="dxa" w:w="60"/>
-              <w:left w:type="dxa" w:w="100"/>
-              <w:bottom w:type="dxa" w:w="60"/>
-              <w:right w:type="dxa" w:w="100"/>
-            </w:tcMar>
-          </w:tcPr>
-          <w:p>
-            <w:pPr>
-              <w:spacing w:after="40"/>
-            </w:pPr>
-            <w:r>
-              <w:rPr>
-                <w:shd w:fill="FFF176" w:color="auto" w:val="clear"/>
-              </w:rPr>
-              <w:t xml:space="preserve">Red / provincia</w:t>
+            <w:tcW w:type="dxa" w:w="3000"/>
+            <w:tcMar>
+              <w:top w:type="dxa" w:w="60"/>
+              <w:left w:type="dxa" w:w="100"/>
+              <w:bottom w:type="dxa" w:w="60"/>
+              <w:right w:type="dxa" w:w="100"/>
+            </w:tcMar>
+          </w:tcPr>
+          <w:p>
+            <w:pPr>
+              <w:spacing w:after="40"/>
+            </w:pPr>
+            <w:r>
+              <w:t xml:space="preserve">1er nivel con colposcopia y biopsia</w:t>
+            </w:r>
+          </w:p>
+        </w:tc>
+        <w:tc>
+          <w:tcPr>
+            <w:tcW w:type="dxa" w:w="800"/>
+            <w:tcMar>
+              <w:top w:type="dxa" w:w="60"/>
+              <w:left w:type="dxa" w:w="100"/>
+              <w:bottom w:type="dxa" w:w="60"/>
+              <w:right w:type="dxa" w:w="100"/>
+            </w:tcMar>
+          </w:tcPr>
+          <w:p>
+            <w:pPr>
+              <w:spacing w:after="40"/>
+            </w:pPr>
+            <w:r>
+              <w:t xml:space="preserve">1</w:t>
             </w:r>
           </w:p>
         </w:tc>
@@ -3247,45 +3388,45 @@
               <w:spacing w:after="40"/>
             </w:pPr>
             <w:r>
-              <w:t xml:space="preserve">1er</w:t>
-            </w:r>
-          </w:p>
-        </w:tc>
-        <w:tc>
-          <w:tcPr>
-            <w:tcW w:type="dxa" w:w="1100"/>
-            <w:tcMar>
-              <w:top w:type="dxa" w:w="60"/>
-              <w:left w:type="dxa" w:w="100"/>
-              <w:bottom w:type="dxa" w:w="60"/>
-              <w:right w:type="dxa" w:w="100"/>
-            </w:tcMar>
-          </w:tcPr>
-          <w:p>
-            <w:pPr>
-              <w:spacing w:after="40"/>
-            </w:pPr>
-            <w:r>
-              <w:t xml:space="preserve">100</w:t>
-            </w:r>
-          </w:p>
-        </w:tc>
-        <w:tc>
-          <w:tcPr>
-            <w:tcW w:type="dxa" w:w="1326"/>
-            <w:tcMar>
-              <w:top w:type="dxa" w:w="60"/>
-              <w:left w:type="dxa" w:w="100"/>
-              <w:bottom w:type="dxa" w:w="60"/>
-              <w:right w:type="dxa" w:w="100"/>
-            </w:tcMar>
-          </w:tcPr>
-          <w:p>
-            <w:pPr>
-              <w:spacing w:after="40"/>
-            </w:pPr>
-            <w:r>
-              <w:t xml:space="preserve">696,00</w:t>
+              <w:t xml:space="preserve">250</w:t>
+            </w:r>
+          </w:p>
+        </w:tc>
+        <w:tc>
+          <w:tcPr>
+            <w:tcW w:type="dxa" w:w="2126"/>
+            <w:tcMar>
+              <w:top w:type="dxa" w:w="60"/>
+              <w:left w:type="dxa" w:w="100"/>
+              <w:bottom w:type="dxa" w:w="60"/>
+              <w:right w:type="dxa" w:w="100"/>
+            </w:tcMar>
+          </w:tcPr>
+          <w:p>
+            <w:pPr>
+              <w:spacing w:after="40"/>
+            </w:pPr>
+            <w:r>
+              <w:t xml:space="preserve">250</w:t>
+            </w:r>
+          </w:p>
+        </w:tc>
+        <w:tc>
+          <w:tcPr>
+            <w:tcW w:type="dxa" w:w="1800"/>
+            <w:tcMar>
+              <w:top w:type="dxa" w:w="60"/>
+              <w:left w:type="dxa" w:w="100"/>
+              <w:bottom w:type="dxa" w:w="60"/>
+              <w:right w:type="dxa" w:w="100"/>
+            </w:tcMar>
+          </w:tcPr>
+          <w:p>
+            <w:pPr>
+              <w:spacing w:after="40"/>
+            </w:pPr>
+            <w:r>
+              <w:t xml:space="preserve">200</w:t>
             </w:r>
           </w:p>
         </w:tc>
@@ -3293,45 +3434,39 @@
       <w:tr>
         <w:tc>
           <w:tcPr>
-            <w:tcW w:type="dxa" w:w="3100"/>
-            <w:tcMar>
-              <w:top w:type="dxa" w:w="60"/>
-              <w:left w:type="dxa" w:w="100"/>
-              <w:bottom w:type="dxa" w:w="60"/>
-              <w:right w:type="dxa" w:w="100"/>
-            </w:tcMar>
-          </w:tcPr>
-          <w:p>
-            <w:pPr>
-              <w:spacing w:after="40"/>
-            </w:pPr>
-            <w:r>
-              <w:rPr>
-                <w:shd w:fill="FFF176" w:color="auto" w:val="clear"/>
-              </w:rPr>
-              <w:t xml:space="preserve">Hospital ...</w:t>
-            </w:r>
-          </w:p>
-        </w:tc>
-        <w:tc>
-          <w:tcPr>
-            <w:tcW w:type="dxa" w:w="2200"/>
-            <w:tcMar>
-              <w:top w:type="dxa" w:w="60"/>
-              <w:left w:type="dxa" w:w="100"/>
-              <w:bottom w:type="dxa" w:w="60"/>
-              <w:right w:type="dxa" w:w="100"/>
-            </w:tcMar>
-          </w:tcPr>
-          <w:p>
-            <w:pPr>
-              <w:spacing w:after="40"/>
-            </w:pPr>
-            <w:r>
-              <w:rPr>
-                <w:shd w:fill="FFF176" w:color="auto" w:val="clear"/>
-              </w:rPr>
-              <w:t xml:space="preserve">__________</w:t>
+            <w:tcW w:type="dxa" w:w="3000"/>
+            <w:tcMar>
+              <w:top w:type="dxa" w:w="60"/>
+              <w:left w:type="dxa" w:w="100"/>
+              <w:bottom w:type="dxa" w:w="60"/>
+              <w:right w:type="dxa" w:w="100"/>
+            </w:tcMar>
+          </w:tcPr>
+          <w:p>
+            <w:pPr>
+              <w:spacing w:after="40"/>
+            </w:pPr>
+            <w:r>
+              <w:t xml:space="preserve">2º nivel (hospital)</w:t>
+            </w:r>
+          </w:p>
+        </w:tc>
+        <w:tc>
+          <w:tcPr>
+            <w:tcW w:type="dxa" w:w="800"/>
+            <w:tcMar>
+              <w:top w:type="dxa" w:w="60"/>
+              <w:left w:type="dxa" w:w="100"/>
+              <w:bottom w:type="dxa" w:w="60"/>
+              <w:right w:type="dxa" w:w="100"/>
+            </w:tcMar>
+          </w:tcPr>
+          <w:p>
+            <w:pPr>
+              <w:spacing w:after="40"/>
+            </w:pPr>
+            <w:r>
+              <w:t xml:space="preserve">1</w:t>
             </w:r>
           </w:p>
         </w:tc>
@@ -3350,45 +3485,45 @@
               <w:spacing w:after="40"/>
             </w:pPr>
             <w:r>
-              <w:t xml:space="preserve">2º</w:t>
-            </w:r>
-          </w:p>
-        </w:tc>
-        <w:tc>
-          <w:tcPr>
-            <w:tcW w:type="dxa" w:w="1100"/>
-            <w:tcMar>
-              <w:top w:type="dxa" w:w="60"/>
-              <w:left w:type="dxa" w:w="100"/>
-              <w:bottom w:type="dxa" w:w="60"/>
-              <w:right w:type="dxa" w:w="100"/>
-            </w:tcMar>
-          </w:tcPr>
-          <w:p>
-            <w:pPr>
-              <w:spacing w:after="40"/>
-            </w:pPr>
-            <w:r>
               <w:t xml:space="preserve">250</w:t>
             </w:r>
           </w:p>
         </w:tc>
         <w:tc>
           <w:tcPr>
-            <w:tcW w:type="dxa" w:w="1326"/>
-            <w:tcMar>
-              <w:top w:type="dxa" w:w="60"/>
-              <w:left w:type="dxa" w:w="100"/>
-              <w:bottom w:type="dxa" w:w="60"/>
-              <w:right w:type="dxa" w:w="100"/>
-            </w:tcMar>
-          </w:tcPr>
-          <w:p>
-            <w:pPr>
-              <w:spacing w:after="40"/>
-            </w:pPr>
-            <w:r>
-              <w:t xml:space="preserve">1.740,00</w:t>
+            <w:tcW w:type="dxa" w:w="2126"/>
+            <w:tcMar>
+              <w:top w:type="dxa" w:w="60"/>
+              <w:left w:type="dxa" w:w="100"/>
+              <w:bottom w:type="dxa" w:w="60"/>
+              <w:right w:type="dxa" w:w="100"/>
+            </w:tcMar>
+          </w:tcPr>
+          <w:p>
+            <w:pPr>
+              <w:spacing w:after="40"/>
+            </w:pPr>
+            <w:r>
+              <w:t xml:space="preserve">250</w:t>
+            </w:r>
+          </w:p>
+        </w:tc>
+        <w:tc>
+          <w:tcPr>
+            <w:tcW w:type="dxa" w:w="1800"/>
+            <w:tcMar>
+              <w:top w:type="dxa" w:w="60"/>
+              <w:left w:type="dxa" w:w="100"/>
+              <w:bottom w:type="dxa" w:w="60"/>
+              <w:right w:type="dxa" w:w="100"/>
+            </w:tcMar>
+          </w:tcPr>
+          <w:p>
+            <w:pPr>
+              <w:spacing w:after="40"/>
+            </w:pPr>
+            <w:r>
+              <w:t xml:space="preserve">500</w:t>
             </w:r>
           </w:p>
         </w:tc>
@@ -3396,45 +3531,39 @@
       <w:tr>
         <w:tc>
           <w:tcPr>
-            <w:tcW w:type="dxa" w:w="3100"/>
-            <w:tcMar>
-              <w:top w:type="dxa" w:w="60"/>
-              <w:left w:type="dxa" w:w="100"/>
-              <w:bottom w:type="dxa" w:w="60"/>
-              <w:right w:type="dxa" w:w="100"/>
-            </w:tcMar>
-          </w:tcPr>
-          <w:p>
-            <w:pPr>
-              <w:spacing w:after="40"/>
-            </w:pPr>
-            <w:r>
-              <w:rPr>
-                <w:shd w:fill="FFF176" w:color="auto" w:val="clear"/>
-              </w:rPr>
-              <w:t xml:space="preserve">Hospital / laboratorio / Oncológico</w:t>
-            </w:r>
-          </w:p>
-        </w:tc>
-        <w:tc>
-          <w:tcPr>
-            <w:tcW w:type="dxa" w:w="2200"/>
-            <w:tcMar>
-              <w:top w:type="dxa" w:w="60"/>
-              <w:left w:type="dxa" w:w="100"/>
-              <w:bottom w:type="dxa" w:w="60"/>
-              <w:right w:type="dxa" w:w="100"/>
-            </w:tcMar>
-          </w:tcPr>
-          <w:p>
-            <w:pPr>
-              <w:spacing w:after="40"/>
-            </w:pPr>
-            <w:r>
-              <w:rPr>
-                <w:shd w:fill="FFF176" w:color="auto" w:val="clear"/>
-              </w:rPr>
-              <w:t xml:space="preserve">__________</w:t>
+            <w:tcW w:type="dxa" w:w="3000"/>
+            <w:tcMar>
+              <w:top w:type="dxa" w:w="60"/>
+              <w:left w:type="dxa" w:w="100"/>
+              <w:bottom w:type="dxa" w:w="60"/>
+              <w:right w:type="dxa" w:w="100"/>
+            </w:tcMar>
+          </w:tcPr>
+          <w:p>
+            <w:pPr>
+              <w:spacing w:after="40"/>
+            </w:pPr>
+            <w:r>
+              <w:t xml:space="preserve">4º nivel: Oncológico con laboratorio PAP y VPH</w:t>
+            </w:r>
+          </w:p>
+        </w:tc>
+        <w:tc>
+          <w:tcPr>
+            <w:tcW w:type="dxa" w:w="800"/>
+            <w:tcMar>
+              <w:top w:type="dxa" w:w="60"/>
+              <w:left w:type="dxa" w:w="100"/>
+              <w:bottom w:type="dxa" w:w="60"/>
+              <w:right w:type="dxa" w:w="100"/>
+            </w:tcMar>
+          </w:tcPr>
+          <w:p>
+            <w:pPr>
+              <w:spacing w:after="40"/>
+            </w:pPr>
+            <w:r>
+              <w:t xml:space="preserve">1</w:t>
             </w:r>
           </w:p>
         </w:tc>
@@ -3453,45 +3582,45 @@
               <w:spacing w:after="40"/>
             </w:pPr>
             <w:r>
-              <w:t xml:space="preserve">3er / lab / 4º</w:t>
-            </w:r>
-          </w:p>
-        </w:tc>
-        <w:tc>
-          <w:tcPr>
-            <w:tcW w:type="dxa" w:w="1100"/>
-            <w:tcMar>
-              <w:top w:type="dxa" w:w="60"/>
-              <w:left w:type="dxa" w:w="100"/>
-              <w:bottom w:type="dxa" w:w="60"/>
-              <w:right w:type="dxa" w:w="100"/>
-            </w:tcMar>
-          </w:tcPr>
-          <w:p>
-            <w:pPr>
-              <w:spacing w:after="40"/>
-            </w:pPr>
-            <w:r>
               <w:t xml:space="preserve">501</w:t>
             </w:r>
           </w:p>
         </w:tc>
         <w:tc>
           <w:tcPr>
-            <w:tcW w:type="dxa" w:w="1326"/>
-            <w:tcMar>
-              <w:top w:type="dxa" w:w="60"/>
-              <w:left w:type="dxa" w:w="100"/>
-              <w:bottom w:type="dxa" w:w="60"/>
-              <w:right w:type="dxa" w:w="100"/>
-            </w:tcMar>
-          </w:tcPr>
-          <w:p>
-            <w:pPr>
-              <w:spacing w:after="40"/>
-            </w:pPr>
-            <w:r>
-              <w:t xml:space="preserve">3.486,96</w:t>
+            <w:tcW w:type="dxa" w:w="2126"/>
+            <w:tcMar>
+              <w:top w:type="dxa" w:w="60"/>
+              <w:left w:type="dxa" w:w="100"/>
+              <w:bottom w:type="dxa" w:w="60"/>
+              <w:right w:type="dxa" w:w="100"/>
+            </w:tcMar>
+          </w:tcPr>
+          <w:p>
+            <w:pPr>
+              <w:spacing w:after="40"/>
+            </w:pPr>
+            <w:r>
+              <w:t xml:space="preserve">501</w:t>
+            </w:r>
+          </w:p>
+        </w:tc>
+        <w:tc>
+          <w:tcPr>
+            <w:tcW w:type="dxa" w:w="1800"/>
+            <w:tcMar>
+              <w:top w:type="dxa" w:w="60"/>
+              <w:left w:type="dxa" w:w="100"/>
+              <w:bottom w:type="dxa" w:w="60"/>
+              <w:right w:type="dxa" w:w="100"/>
+            </w:tcMar>
+          </w:tcPr>
+          <w:p>
+            <w:pPr>
+              <w:spacing w:after="40"/>
+            </w:pPr>
+            <w:r>
+              <w:t xml:space="preserve">550</w:t>
             </w:r>
           </w:p>
         </w:tc>
@@ -3499,7 +3628,7 @@
       <w:tr>
         <w:tc>
           <w:tcPr>
-            <w:tcW w:type="dxa" w:w="3100"/>
+            <w:tcW w:type="dxa" w:w="3000"/>
             <w:tcMar>
               <w:top w:type="dxa" w:w="60"/>
               <w:left w:type="dxa" w:w="100"/>
@@ -3522,18 +3651,25 @@
         </w:tc>
         <w:tc>
           <w:tcPr>
-            <w:tcW w:type="dxa" w:w="2200"/>
-            <w:tcMar>
-              <w:top w:type="dxa" w:w="60"/>
-              <w:left w:type="dxa" w:w="100"/>
-              <w:bottom w:type="dxa" w:w="60"/>
-              <w:right w:type="dxa" w:w="100"/>
-            </w:tcMar>
-          </w:tcPr>
-          <w:p>
-            <w:pPr>
-              <w:spacing w:after="40"/>
-            </w:pPr>
+            <w:tcW w:type="dxa" w:w="800"/>
+            <w:tcMar>
+              <w:top w:type="dxa" w:w="60"/>
+              <w:left w:type="dxa" w:w="100"/>
+              <w:bottom w:type="dxa" w:w="60"/>
+              <w:right w:type="dxa" w:w="100"/>
+            </w:tcMar>
+          </w:tcPr>
+          <w:p>
+            <w:pPr>
+              <w:spacing w:after="40"/>
+            </w:pPr>
+            <w:r>
+              <w:rPr>
+                <w:b/>
+                <w:bCs/>
+              </w:rPr>
+              <w:t xml:space="preserve">11</w:t>
+            </w:r>
           </w:p>
         </w:tc>
         <w:tc>
@@ -3554,7 +3690,7 @@
         </w:tc>
         <w:tc>
           <w:tcPr>
-            <w:tcW w:type="dxa" w:w="1100"/>
+            <w:tcW w:type="dxa" w:w="2126"/>
             <w:tcMar>
               <w:top w:type="dxa" w:w="60"/>
               <w:left w:type="dxa" w:w="100"/>
@@ -3568,15 +3704,42 @@
             </w:pPr>
             <w:r>
               <w:rPr>
-                <w:shd w:fill="FFF176" w:color="auto" w:val="clear"/>
+                <w:b/>
+                <w:bCs/>
               </w:rPr>
-              <w:t xml:space="preserve">__________</w:t>
-            </w:r>
-          </w:p>
-        </w:tc>
-        <w:tc>
-          <w:tcPr>
-            <w:tcW w:type="dxa" w:w="1326"/>
+              <w:t xml:space="preserve">US$ 1.801</w:t>
+            </w:r>
+          </w:p>
+          <w:p>
+            <w:pPr>
+              <w:spacing w:after="40"/>
+            </w:pPr>
+            <w:r>
+              <w:t xml:space="preserve">(Bs 12.534,96)</w:t>
+            </w:r>
+          </w:p>
+        </w:tc>
+        <w:tc>
+          <w:tcPr>
+            <w:tcW w:type="dxa" w:w="1800"/>
+            <w:tcMar>
+              <w:top w:type="dxa" w:w="60"/>
+              <w:left w:type="dxa" w:w="100"/>
+              <w:bottom w:type="dxa" w:w="60"/>
+              <w:right w:type="dxa" w:w="100"/>
+            </w:tcMar>
+          </w:tcPr>
+          <w:p>
+            <w:pPr>
+              <w:spacing w:after="40"/>
+            </w:pPr>
+          </w:p>
+        </w:tc>
+      </w:tr>
+      <w:tr>
+        <w:tc>
+          <w:tcPr>
+            <w:tcW w:type="dxa" w:w="3000"/>
             <w:tcMar>
               <w:top w:type="dxa" w:w="60"/>
               <w:left w:type="dxa" w:w="100"/>
@@ -3590,10 +3753,298 @@
             </w:pPr>
             <w:r>
               <w:rPr>
-                <w:shd w:fill="FFF176" w:color="auto" w:val="clear"/>
+                <w:b/>
+                <w:bCs/>
               </w:rPr>
-              <w:t xml:space="preserve">__________</w:t>
-            </w:r>
+              <w:t xml:space="preserve">Total anual (12 meses)</w:t>
+            </w:r>
+          </w:p>
+        </w:tc>
+        <w:tc>
+          <w:tcPr>
+            <w:tcW w:type="dxa" w:w="800"/>
+            <w:tcMar>
+              <w:top w:type="dxa" w:w="60"/>
+              <w:left w:type="dxa" w:w="100"/>
+              <w:bottom w:type="dxa" w:w="60"/>
+              <w:right w:type="dxa" w:w="100"/>
+            </w:tcMar>
+          </w:tcPr>
+          <w:p>
+            <w:pPr>
+              <w:spacing w:after="40"/>
+            </w:pPr>
+          </w:p>
+        </w:tc>
+        <w:tc>
+          <w:tcPr>
+            <w:tcW w:type="dxa" w:w="1300"/>
+            <w:tcMar>
+              <w:top w:type="dxa" w:w="60"/>
+              <w:left w:type="dxa" w:w="100"/>
+              <w:bottom w:type="dxa" w:w="60"/>
+              <w:right w:type="dxa" w:w="100"/>
+            </w:tcMar>
+          </w:tcPr>
+          <w:p>
+            <w:pPr>
+              <w:spacing w:after="40"/>
+            </w:pPr>
+          </w:p>
+        </w:tc>
+        <w:tc>
+          <w:tcPr>
+            <w:tcW w:type="dxa" w:w="2126"/>
+            <w:tcMar>
+              <w:top w:type="dxa" w:w="60"/>
+              <w:left w:type="dxa" w:w="100"/>
+              <w:bottom w:type="dxa" w:w="60"/>
+              <w:right w:type="dxa" w:w="100"/>
+            </w:tcMar>
+          </w:tcPr>
+          <w:p>
+            <w:pPr>
+              <w:spacing w:after="40"/>
+            </w:pPr>
+            <w:r>
+              <w:rPr>
+                <w:b/>
+                <w:bCs/>
+              </w:rPr>
+              <w:t xml:space="preserve">US$ 21.612</w:t>
+            </w:r>
+          </w:p>
+          <w:p>
+            <w:pPr>
+              <w:spacing w:after="40"/>
+            </w:pPr>
+            <w:r>
+              <w:t xml:space="preserve">(Bs 150.419,52)</w:t>
+            </w:r>
+          </w:p>
+        </w:tc>
+        <w:tc>
+          <w:tcPr>
+            <w:tcW w:type="dxa" w:w="1800"/>
+            <w:tcMar>
+              <w:top w:type="dxa" w:w="60"/>
+              <w:left w:type="dxa" w:w="100"/>
+              <w:bottom w:type="dxa" w:w="60"/>
+              <w:right w:type="dxa" w:w="100"/>
+            </w:tcMar>
+          </w:tcPr>
+          <w:p>
+            <w:pPr>
+              <w:spacing w:after="40"/>
+            </w:pPr>
+          </w:p>
+        </w:tc>
+      </w:tr>
+      <w:tr>
+        <w:tc>
+          <w:tcPr>
+            <w:tcW w:type="dxa" w:w="3000"/>
+            <w:tcMar>
+              <w:top w:type="dxa" w:w="60"/>
+              <w:left w:type="dxa" w:w="100"/>
+              <w:bottom w:type="dxa" w:w="60"/>
+              <w:right w:type="dxa" w:w="100"/>
+            </w:tcMar>
+          </w:tcPr>
+          <w:p>
+            <w:pPr>
+              <w:spacing w:after="40"/>
+            </w:pPr>
+            <w:r>
+              <w:rPr>
+                <w:b/>
+                <w:bCs/>
+              </w:rPr>
+              <w:t xml:space="preserve">Implantación (una vez)</w:t>
+            </w:r>
+          </w:p>
+        </w:tc>
+        <w:tc>
+          <w:tcPr>
+            <w:tcW w:type="dxa" w:w="800"/>
+            <w:tcMar>
+              <w:top w:type="dxa" w:w="60"/>
+              <w:left w:type="dxa" w:w="100"/>
+              <w:bottom w:type="dxa" w:w="60"/>
+              <w:right w:type="dxa" w:w="100"/>
+            </w:tcMar>
+          </w:tcPr>
+          <w:p>
+            <w:pPr>
+              <w:spacing w:after="40"/>
+            </w:pPr>
+          </w:p>
+        </w:tc>
+        <w:tc>
+          <w:tcPr>
+            <w:tcW w:type="dxa" w:w="1300"/>
+            <w:tcMar>
+              <w:top w:type="dxa" w:w="60"/>
+              <w:left w:type="dxa" w:w="100"/>
+              <w:bottom w:type="dxa" w:w="60"/>
+              <w:right w:type="dxa" w:w="100"/>
+            </w:tcMar>
+          </w:tcPr>
+          <w:p>
+            <w:pPr>
+              <w:spacing w:after="40"/>
+            </w:pPr>
+          </w:p>
+        </w:tc>
+        <w:tc>
+          <w:tcPr>
+            <w:tcW w:type="dxa" w:w="2126"/>
+            <w:tcMar>
+              <w:top w:type="dxa" w:w="60"/>
+              <w:left w:type="dxa" w:w="100"/>
+              <w:bottom w:type="dxa" w:w="60"/>
+              <w:right w:type="dxa" w:w="100"/>
+            </w:tcMar>
+          </w:tcPr>
+          <w:p>
+            <w:pPr>
+              <w:spacing w:after="40"/>
+            </w:pPr>
+          </w:p>
+        </w:tc>
+        <w:tc>
+          <w:tcPr>
+            <w:tcW w:type="dxa" w:w="1800"/>
+            <w:tcMar>
+              <w:top w:type="dxa" w:w="60"/>
+              <w:left w:type="dxa" w:w="100"/>
+              <w:bottom w:type="dxa" w:w="60"/>
+              <w:right w:type="dxa" w:w="100"/>
+            </w:tcMar>
+          </w:tcPr>
+          <w:p>
+            <w:pPr>
+              <w:spacing w:after="40"/>
+            </w:pPr>
+            <w:r>
+              <w:rPr>
+                <w:b/>
+                <w:bCs/>
+              </w:rPr>
+              <w:t xml:space="preserve">US$ 2.850</w:t>
+            </w:r>
+          </w:p>
+          <w:p>
+            <w:pPr>
+              <w:spacing w:after="40"/>
+            </w:pPr>
+            <w:r>
+              <w:t xml:space="preserve">(Bs 19.836,00)</w:t>
+            </w:r>
+          </w:p>
+        </w:tc>
+      </w:tr>
+      <w:tr>
+        <w:tc>
+          <w:tcPr>
+            <w:tcW w:type="dxa" w:w="3000"/>
+            <w:tcMar>
+              <w:top w:type="dxa" w:w="60"/>
+              <w:left w:type="dxa" w:w="100"/>
+              <w:bottom w:type="dxa" w:w="60"/>
+              <w:right w:type="dxa" w:w="100"/>
+            </w:tcMar>
+          </w:tcPr>
+          <w:p>
+            <w:pPr>
+              <w:spacing w:after="40"/>
+            </w:pPr>
+            <w:r>
+              <w:rPr>
+                <w:b/>
+                <w:bCs/>
+              </w:rPr>
+              <w:t xml:space="preserve">Total del primer año</w:t>
+            </w:r>
+          </w:p>
+        </w:tc>
+        <w:tc>
+          <w:tcPr>
+            <w:tcW w:type="dxa" w:w="800"/>
+            <w:tcMar>
+              <w:top w:type="dxa" w:w="60"/>
+              <w:left w:type="dxa" w:w="100"/>
+              <w:bottom w:type="dxa" w:w="60"/>
+              <w:right w:type="dxa" w:w="100"/>
+            </w:tcMar>
+          </w:tcPr>
+          <w:p>
+            <w:pPr>
+              <w:spacing w:after="40"/>
+            </w:pPr>
+          </w:p>
+        </w:tc>
+        <w:tc>
+          <w:tcPr>
+            <w:tcW w:type="dxa" w:w="1300"/>
+            <w:tcMar>
+              <w:top w:type="dxa" w:w="60"/>
+              <w:left w:type="dxa" w:w="100"/>
+              <w:bottom w:type="dxa" w:w="60"/>
+              <w:right w:type="dxa" w:w="100"/>
+            </w:tcMar>
+          </w:tcPr>
+          <w:p>
+            <w:pPr>
+              <w:spacing w:after="40"/>
+            </w:pPr>
+          </w:p>
+        </w:tc>
+        <w:tc>
+          <w:tcPr>
+            <w:tcW w:type="dxa" w:w="2126"/>
+            <w:tcMar>
+              <w:top w:type="dxa" w:w="60"/>
+              <w:left w:type="dxa" w:w="100"/>
+              <w:bottom w:type="dxa" w:w="60"/>
+              <w:right w:type="dxa" w:w="100"/>
+            </w:tcMar>
+          </w:tcPr>
+          <w:p>
+            <w:pPr>
+              <w:spacing w:after="40"/>
+            </w:pPr>
+            <w:r>
+              <w:rPr>
+                <w:b/>
+                <w:bCs/>
+              </w:rPr>
+              <w:t xml:space="preserve">US$ 24.462</w:t>
+            </w:r>
+          </w:p>
+          <w:p>
+            <w:pPr>
+              <w:spacing w:after="40"/>
+            </w:pPr>
+            <w:r>
+              <w:t xml:space="preserve">(Bs 170.255,52)</w:t>
+            </w:r>
+          </w:p>
+        </w:tc>
+        <w:tc>
+          <w:tcPr>
+            <w:tcW w:type="dxa" w:w="1800"/>
+            <w:tcMar>
+              <w:top w:type="dxa" w:w="60"/>
+              <w:left w:type="dxa" w:w="100"/>
+              <w:bottom w:type="dxa" w:w="60"/>
+              <w:right w:type="dxa" w:w="100"/>
+            </w:tcMar>
+          </w:tcPr>
+          <w:p>
+            <w:pPr>
+              <w:spacing w:after="40"/>
+            </w:pPr>
           </w:p>
         </w:tc>
       </w:tr>

</xml_diff>

<commit_message>
Precios nuevos, acceso demo/demo con barra de puertas y pasos 23-35 para la base DEMO (v1.15.0)
Co-Authored-By: Claude Opus 5.5 <noreply@anthropic.com>
Claude-Session: https://claude.ai/code/session_015MG6VeavRZnDbjYZyzDjvL
</commit_message>
<xml_diff>
--- a/docs/empresa/SIVEC-contrato-modelo.docx
+++ b/docs/empresa/SIVEC-contrato-modelo.docx
@@ -1127,7 +1127,7 @@
               <w:spacing w:after="40"/>
             </w:pPr>
             <w:r>
-              <w:t xml:space="preserve">US$ 100</w:t>
+              <w:t xml:space="preserve">US$ 120</w:t>
             </w:r>
           </w:p>
         </w:tc>
@@ -1146,7 +1146,7 @@
               <w:spacing w:after="40"/>
             </w:pPr>
             <w:r>
-              <w:t xml:space="preserve">Bs 696,00</w:t>
+              <w:t xml:space="preserve">Bs 835,20</w:t>
             </w:r>
           </w:p>
         </w:tc>
@@ -1186,7 +1186,7 @@
               <w:spacing w:after="40"/>
             </w:pPr>
             <w:r>
-              <w:t xml:space="preserve">US$ 250</w:t>
+              <w:t xml:space="preserve">US$ 270</w:t>
             </w:r>
           </w:p>
         </w:tc>
@@ -1205,7 +1205,7 @@
               <w:spacing w:after="40"/>
             </w:pPr>
             <w:r>
-              <w:t xml:space="preserve">Bs 1.740,00</w:t>
+              <w:t xml:space="preserve">Bs 1.879,20</w:t>
             </w:r>
           </w:p>
         </w:tc>
@@ -1245,7 +1245,7 @@
               <w:spacing w:after="40"/>
             </w:pPr>
             <w:r>
-              <w:t xml:space="preserve">US$ 250</w:t>
+              <w:t xml:space="preserve">US$ 275</w:t>
             </w:r>
           </w:p>
         </w:tc>
@@ -1264,7 +1264,7 @@
               <w:spacing w:after="40"/>
             </w:pPr>
             <w:r>
-              <w:t xml:space="preserve">Bs 1.740,00</w:t>
+              <w:t xml:space="preserve">Bs 1.914,00</w:t>
             </w:r>
           </w:p>
         </w:tc>
@@ -1304,7 +1304,7 @@
               <w:spacing w:after="40"/>
             </w:pPr>
             <w:r>
-              <w:t xml:space="preserve">US$ 501</w:t>
+              <w:t xml:space="preserve">US$ 521</w:t>
             </w:r>
           </w:p>
         </w:tc>
@@ -1323,7 +1323,7 @@
               <w:spacing w:after="40"/>
             </w:pPr>
             <w:r>
-              <w:t xml:space="preserve">Bs 3.486,96</w:t>
+              <w:t xml:space="preserve">Bs 3.626,16</w:t>
             </w:r>
           </w:p>
         </w:tc>
@@ -1363,7 +1363,7 @@
               <w:spacing w:after="40"/>
             </w:pPr>
             <w:r>
-              <w:t xml:space="preserve">Incluido</w:t>
+              <w:t xml:space="preserve">US$ 250</w:t>
             </w:r>
           </w:p>
         </w:tc>
@@ -1382,7 +1382,7 @@
               <w:spacing w:after="40"/>
             </w:pPr>
             <w:r>
-              <w:t xml:space="preserve">Incluido</w:t>
+              <w:t xml:space="preserve">Bs 1.740,00</w:t>
             </w:r>
           </w:p>
         </w:tc>
@@ -1639,7 +1639,7 @@
               <w:spacing w:after="40"/>
             </w:pPr>
             <w:r>
-              <w:t xml:space="preserve">US$ 200</w:t>
+              <w:t xml:space="preserve">US$ 225</w:t>
             </w:r>
           </w:p>
         </w:tc>
@@ -1658,7 +1658,7 @@
               <w:spacing w:after="40"/>
             </w:pPr>
             <w:r>
-              <w:t xml:space="preserve">Bs 1.392,00</w:t>
+              <w:t xml:space="preserve">Bs 1.566,00</w:t>
             </w:r>
           </w:p>
         </w:tc>
@@ -1698,7 +1698,7 @@
               <w:spacing w:after="40"/>
             </w:pPr>
             <w:r>
-              <w:t xml:space="preserve">US$ 500</w:t>
+              <w:t xml:space="preserve">US$ 525</w:t>
             </w:r>
           </w:p>
         </w:tc>
@@ -1717,7 +1717,7 @@
               <w:spacing w:after="40"/>
             </w:pPr>
             <w:r>
-              <w:t xml:space="preserve">Bs 3.480,00</w:t>
+              <w:t xml:space="preserve">Bs 3.654,00</w:t>
             </w:r>
           </w:p>
         </w:tc>
@@ -1757,7 +1757,7 @@
               <w:spacing w:after="40"/>
             </w:pPr>
             <w:r>
-              <w:t xml:space="preserve">US$ 550</w:t>
+              <w:t xml:space="preserve">US$ 575</w:t>
             </w:r>
           </w:p>
         </w:tc>
@@ -1776,7 +1776,7 @@
               <w:spacing w:after="40"/>
             </w:pPr>
             <w:r>
-              <w:t xml:space="preserve">Bs 3.828,00</w:t>
+              <w:t xml:space="preserve">Bs 4.002,00</w:t>
             </w:r>
           </w:p>
         </w:tc>
@@ -3291,7 +3291,7 @@
               <w:spacing w:after="40"/>
             </w:pPr>
             <w:r>
-              <w:t xml:space="preserve">100</w:t>
+              <w:t xml:space="preserve">120</w:t>
             </w:r>
           </w:p>
         </w:tc>
@@ -3310,7 +3310,7 @@
               <w:spacing w:after="40"/>
             </w:pPr>
             <w:r>
-              <w:t xml:space="preserve">800</w:t>
+              <w:t xml:space="preserve">960</w:t>
             </w:r>
           </w:p>
         </w:tc>
@@ -3329,7 +3329,7 @@
               <w:spacing w:after="40"/>
             </w:pPr>
             <w:r>
-              <w:t xml:space="preserve">1.600</w:t>
+              <w:t xml:space="preserve">1.800</w:t>
             </w:r>
           </w:p>
         </w:tc>
@@ -3388,7 +3388,7 @@
               <w:spacing w:after="40"/>
             </w:pPr>
             <w:r>
-              <w:t xml:space="preserve">250</w:t>
+              <w:t xml:space="preserve">270</w:t>
             </w:r>
           </w:p>
         </w:tc>
@@ -3407,7 +3407,7 @@
               <w:spacing w:after="40"/>
             </w:pPr>
             <w:r>
-              <w:t xml:space="preserve">250</w:t>
+              <w:t xml:space="preserve">270</w:t>
             </w:r>
           </w:p>
         </w:tc>
@@ -3426,7 +3426,7 @@
               <w:spacing w:after="40"/>
             </w:pPr>
             <w:r>
-              <w:t xml:space="preserve">200</w:t>
+              <w:t xml:space="preserve">225</w:t>
             </w:r>
           </w:p>
         </w:tc>
@@ -3485,7 +3485,7 @@
               <w:spacing w:after="40"/>
             </w:pPr>
             <w:r>
-              <w:t xml:space="preserve">250</w:t>
+              <w:t xml:space="preserve">275</w:t>
             </w:r>
           </w:p>
         </w:tc>
@@ -3504,7 +3504,7 @@
               <w:spacing w:after="40"/>
             </w:pPr>
             <w:r>
-              <w:t xml:space="preserve">250</w:t>
+              <w:t xml:space="preserve">275</w:t>
             </w:r>
           </w:p>
         </w:tc>
@@ -3523,7 +3523,7 @@
               <w:spacing w:after="40"/>
             </w:pPr>
             <w:r>
-              <w:t xml:space="preserve">500</w:t>
+              <w:t xml:space="preserve">525</w:t>
             </w:r>
           </w:p>
         </w:tc>
@@ -3582,7 +3582,7 @@
               <w:spacing w:after="40"/>
             </w:pPr>
             <w:r>
-              <w:t xml:space="preserve">501</w:t>
+              <w:t xml:space="preserve">521</w:t>
             </w:r>
           </w:p>
         </w:tc>
@@ -3601,7 +3601,7 @@
               <w:spacing w:after="40"/>
             </w:pPr>
             <w:r>
-              <w:t xml:space="preserve">501</w:t>
+              <w:t xml:space="preserve">521</w:t>
             </w:r>
           </w:p>
         </w:tc>
@@ -3620,7 +3620,7 @@
               <w:spacing w:after="40"/>
             </w:pPr>
             <w:r>
-              <w:t xml:space="preserve">550</w:t>
+              <w:t xml:space="preserve">575</w:t>
             </w:r>
           </w:p>
         </w:tc>
@@ -3707,15 +3707,15 @@
                 <w:b/>
                 <w:bCs/>
               </w:rPr>
-              <w:t xml:space="preserve">US$ 1.801</w:t>
-            </w:r>
-          </w:p>
-          <w:p>
-            <w:pPr>
-              <w:spacing w:after="40"/>
-            </w:pPr>
-            <w:r>
-              <w:t xml:space="preserve">(Bs 12.534,96)</w:t>
+              <w:t xml:space="preserve">US$ 2.026</w:t>
+            </w:r>
+          </w:p>
+          <w:p>
+            <w:pPr>
+              <w:spacing w:after="40"/>
+            </w:pPr>
+            <w:r>
+              <w:t xml:space="preserve">(Bs 14.100,96)</w:t>
             </w:r>
           </w:p>
         </w:tc>
@@ -3811,15 +3811,15 @@
                 <w:b/>
                 <w:bCs/>
               </w:rPr>
-              <w:t xml:space="preserve">US$ 21.612</w:t>
-            </w:r>
-          </w:p>
-          <w:p>
-            <w:pPr>
-              <w:spacing w:after="40"/>
-            </w:pPr>
-            <w:r>
-              <w:t xml:space="preserve">(Bs 150.419,52)</w:t>
+              <w:t xml:space="preserve">US$ 24.312</w:t>
+            </w:r>
+          </w:p>
+          <w:p>
+            <w:pPr>
+              <w:spacing w:after="40"/>
+            </w:pPr>
+            <w:r>
+              <w:t xml:space="preserve">(Bs 169.211,52)</w:t>
             </w:r>
           </w:p>
         </w:tc>
@@ -3931,15 +3931,15 @@
                 <w:b/>
                 <w:bCs/>
               </w:rPr>
-              <w:t xml:space="preserve">US$ 2.850</w:t>
-            </w:r>
-          </w:p>
-          <w:p>
-            <w:pPr>
-              <w:spacing w:after="40"/>
-            </w:pPr>
-            <w:r>
-              <w:t xml:space="preserve">(Bs 19.836,00)</w:t>
+              <w:t xml:space="preserve">US$ 3.125</w:t>
+            </w:r>
+          </w:p>
+          <w:p>
+            <w:pPr>
+              <w:spacing w:after="40"/>
+            </w:pPr>
+            <w:r>
+              <w:t xml:space="preserve">(Bs 21.750,00)</w:t>
             </w:r>
           </w:p>
         </w:tc>
@@ -4019,15 +4019,15 @@
                 <w:b/>
                 <w:bCs/>
               </w:rPr>
-              <w:t xml:space="preserve">US$ 24.462</w:t>
-            </w:r>
-          </w:p>
-          <w:p>
-            <w:pPr>
-              <w:spacing w:after="40"/>
-            </w:pPr>
-            <w:r>
-              <w:t xml:space="preserve">(Bs 170.255,52)</w:t>
+              <w:t xml:space="preserve">US$ 27.437</w:t>
+            </w:r>
+          </w:p>
+          <w:p>
+            <w:pPr>
+              <w:spacing w:after="40"/>
+            </w:pPr>
+            <w:r>
+              <w:t xml:space="preserve">(Bs 190.961,52)</w:t>
             </w:r>
           </w:p>
         </w:tc>

</xml_diff>